<commit_message>
added some pdf versions of files, changed fonts to times new roman.
</commit_message>
<xml_diff>
--- a/DSR Reports - Examples/Nmap/ZenmapReport.docx
+++ b/DSR Reports - Examples/Nmap/ZenmapReport.docx
@@ -6,42 +6,36 @@
       <w:pPr>
         <w:pStyle w:val="Title"/>
         <w:rPr>
-          <w:rFonts w:ascii="Calibri" w:hAnsi="Calibri" w:cs="Calibri"/>
-        </w:rPr>
-      </w:pPr>
-      <w:r>
-        <w:rPr>
-          <w:rFonts w:ascii="Calibri" w:hAnsi="Calibri" w:cs="Calibri"/>
+          <w:rFonts w:ascii="Times New Roman" w:hAnsi="Times New Roman" w:cs="Times New Roman"/>
+        </w:rPr>
+      </w:pPr>
+      <w:r>
+        <w:rPr>
+          <w:rFonts w:ascii="Times New Roman" w:hAnsi="Times New Roman" w:cs="Times New Roman"/>
         </w:rPr>
         <w:t xml:space="preserve">BDSH </w:t>
       </w:r>
       <w:r>
         <w:rPr>
-          <w:rFonts w:ascii="Calibri" w:hAnsi="Calibri" w:cs="Calibri"/>
+          <w:rFonts w:ascii="Times New Roman" w:hAnsi="Times New Roman" w:cs="Times New Roman"/>
         </w:rPr>
         <w:t>Zen map</w:t>
       </w:r>
       <w:r>
         <w:rPr>
-          <w:rFonts w:ascii="Calibri" w:hAnsi="Calibri" w:cs="Calibri"/>
-        </w:rPr>
-        <w:t xml:space="preserve"> (Nmap GUI)</w:t>
-      </w:r>
-      <w:r>
-        <w:rPr>
-          <w:rFonts w:ascii="Calibri" w:hAnsi="Calibri" w:cs="Calibri"/>
-        </w:rPr>
-        <w:t xml:space="preserve"> Report – </w:t>
-      </w:r>
-      <w:r>
-        <w:rPr>
-          <w:rFonts w:ascii="Calibri" w:hAnsi="Calibri" w:cs="Calibri"/>
+          <w:rFonts w:ascii="Times New Roman" w:hAnsi="Times New Roman" w:cs="Times New Roman"/>
+        </w:rPr>
+        <w:t xml:space="preserve"> (Nmap GUI) Report – </w:t>
+      </w:r>
+      <w:r>
+        <w:rPr>
+          <w:rFonts w:ascii="Times New Roman" w:hAnsi="Times New Roman" w:cs="Times New Roman"/>
         </w:rPr>
         <w:t>Example</w:t>
       </w:r>
       <w:r>
         <w:rPr>
-          <w:rFonts w:ascii="Calibri" w:hAnsi="Calibri" w:cs="Calibri"/>
+          <w:rFonts w:ascii="Times New Roman" w:hAnsi="Times New Roman" w:cs="Times New Roman"/>
         </w:rPr>
         <w:t xml:space="preserve"> network.</w:t>
       </w:r>
@@ -49,39 +43,27 @@
     <w:p>
       <w:pPr>
         <w:rPr>
-          <w:rFonts w:ascii="Calibri" w:hAnsi="Calibri" w:cs="Calibri"/>
-        </w:rPr>
-      </w:pPr>
-    </w:p>
-    <w:p>
-      <w:pPr>
-        <w:rPr>
-          <w:rFonts w:ascii="Calibri" w:hAnsi="Calibri" w:cs="Calibri"/>
-        </w:rPr>
-      </w:pPr>
-      <w:r>
-        <w:rPr>
-          <w:rFonts w:ascii="Calibri" w:hAnsi="Calibri" w:cs="Calibri"/>
-        </w:rPr>
-        <w:t xml:space="preserve">This is an example report for a </w:t>
-      </w:r>
-      <w:r>
-        <w:rPr>
-          <w:rFonts w:ascii="Calibri" w:hAnsi="Calibri" w:cs="Calibri"/>
-        </w:rPr>
-        <w:t xml:space="preserve">network </w:t>
-      </w:r>
-      <w:r>
-        <w:rPr>
-          <w:rFonts w:ascii="Calibri" w:hAnsi="Calibri" w:cs="Calibri"/>
-        </w:rPr>
-        <w:t>analysis from a team member of BDSH and does not include any AI analysis.</w:t>
+          <w:rFonts w:ascii="Times New Roman" w:hAnsi="Times New Roman" w:cs="Times New Roman"/>
+        </w:rPr>
+      </w:pPr>
+    </w:p>
+    <w:p>
+      <w:pPr>
+        <w:rPr>
+          <w:rFonts w:ascii="Times New Roman" w:hAnsi="Times New Roman" w:cs="Times New Roman"/>
+        </w:rPr>
+      </w:pPr>
+      <w:r>
+        <w:rPr>
+          <w:rFonts w:ascii="Times New Roman" w:hAnsi="Times New Roman" w:cs="Times New Roman"/>
+        </w:rPr>
+        <w:t>This is an example report for a network analysis from a team member of BDSH and does not include any AI analysis.</w:t>
       </w:r>
     </w:p>
     <w:sdt>
       <w:sdtPr>
         <w:rPr>
-          <w:rFonts w:ascii="Calibri" w:eastAsiaTheme="minorHAnsi" w:hAnsi="Calibri" w:cs="Calibri"/>
+          <w:rFonts w:ascii="Times New Roman" w:eastAsiaTheme="minorHAnsi" w:hAnsi="Times New Roman" w:cs="Times New Roman"/>
           <w:color w:val="auto"/>
           <w:kern w:val="2"/>
           <w:sz w:val="24"/>
@@ -106,12 +88,12 @@
           <w:pPr>
             <w:pStyle w:val="TOCHeading"/>
             <w:rPr>
-              <w:rFonts w:ascii="Calibri" w:hAnsi="Calibri" w:cs="Calibri"/>
+              <w:rFonts w:ascii="Times New Roman" w:hAnsi="Times New Roman" w:cs="Times New Roman"/>
             </w:rPr>
           </w:pPr>
           <w:r>
             <w:rPr>
-              <w:rFonts w:ascii="Calibri" w:hAnsi="Calibri" w:cs="Calibri"/>
+              <w:rFonts w:ascii="Times New Roman" w:hAnsi="Times New Roman" w:cs="Times New Roman"/>
               <w:lang w:val="en-GB"/>
             </w:rPr>
             <w:t>Contents</w:t>
@@ -131,27 +113,27 @@
           </w:pPr>
           <w:r>
             <w:rPr>
-              <w:rFonts w:ascii="Calibri" w:hAnsi="Calibri" w:cs="Calibri"/>
+              <w:rFonts w:ascii="Times New Roman" w:hAnsi="Times New Roman" w:cs="Times New Roman"/>
             </w:rPr>
             <w:fldChar w:fldCharType="begin"/>
           </w:r>
           <w:r>
             <w:rPr>
-              <w:rFonts w:ascii="Calibri" w:hAnsi="Calibri" w:cs="Calibri"/>
+              <w:rFonts w:ascii="Times New Roman" w:hAnsi="Times New Roman" w:cs="Times New Roman"/>
             </w:rPr>
             <w:instrText xml:space="preserve"> TOC \o "1-3" \h \z \u </w:instrText>
           </w:r>
           <w:r>
             <w:rPr>
-              <w:rFonts w:ascii="Calibri" w:hAnsi="Calibri" w:cs="Calibri"/>
+              <w:rFonts w:ascii="Times New Roman" w:hAnsi="Times New Roman" w:cs="Times New Roman"/>
             </w:rPr>
             <w:fldChar w:fldCharType="separate"/>
           </w:r>
-          <w:hyperlink w:anchor="_Toc239624629" w:history="1">
+          <w:hyperlink w:anchor="_Toc241954339" w:history="1">
             <w:r>
               <w:rPr>
                 <w:rStyle w:val="Hyperlink"/>
-                <w:rFonts w:ascii="Calibri" w:hAnsi="Calibri" w:cs="Calibri"/>
+                <w:rFonts w:ascii="Times New Roman" w:hAnsi="Times New Roman" w:cs="Times New Roman"/>
                 <w:noProof/>
                 <w:lang w:val="en-GB"/>
               </w:rPr>
@@ -176,7 +158,7 @@
                 <w:noProof/>
                 <w:webHidden/>
               </w:rPr>
-              <w:instrText xml:space="preserve"> PAGEREF _Toc239624629 \h </w:instrText>
+              <w:instrText xml:space="preserve"> PAGEREF _Toc241954339 \h </w:instrText>
             </w:r>
             <w:r>
               <w:rPr>
@@ -219,11 +201,11 @@
               <w:lang w:eastAsia="en-NZ"/>
             </w:rPr>
           </w:pPr>
-          <w:hyperlink w:anchor="_Toc239624630" w:history="1">
+          <w:hyperlink w:anchor="_Toc241954340" w:history="1">
             <w:r>
               <w:rPr>
                 <w:rStyle w:val="Hyperlink"/>
-                <w:rFonts w:ascii="Calibri" w:hAnsi="Calibri" w:cs="Calibri"/>
+                <w:rFonts w:ascii="Times New Roman" w:hAnsi="Times New Roman" w:cs="Times New Roman"/>
                 <w:noProof/>
               </w:rPr>
               <w:t>General information</w:t>
@@ -247,7 +229,7 @@
                 <w:noProof/>
                 <w:webHidden/>
               </w:rPr>
-              <w:instrText xml:space="preserve"> PAGEREF _Toc239624630 \h </w:instrText>
+              <w:instrText xml:space="preserve"> PAGEREF _Toc241954340 \h </w:instrText>
             </w:r>
             <w:r>
               <w:rPr>
@@ -290,11 +272,11 @@
               <w:lang w:eastAsia="en-NZ"/>
             </w:rPr>
           </w:pPr>
-          <w:hyperlink w:anchor="_Toc239624631" w:history="1">
+          <w:hyperlink w:anchor="_Toc241954341" w:history="1">
             <w:r>
               <w:rPr>
                 <w:rStyle w:val="Hyperlink"/>
-                <w:rFonts w:ascii="Calibri" w:hAnsi="Calibri" w:cs="Calibri"/>
+                <w:rFonts w:ascii="Times New Roman" w:hAnsi="Times New Roman" w:cs="Times New Roman"/>
                 <w:noProof/>
               </w:rPr>
               <w:t>Description of the network</w:t>
@@ -318,7 +300,7 @@
                 <w:noProof/>
                 <w:webHidden/>
               </w:rPr>
-              <w:instrText xml:space="preserve"> PAGEREF _Toc239624631 \h </w:instrText>
+              <w:instrText xml:space="preserve"> PAGEREF _Toc241954341 \h </w:instrText>
             </w:r>
             <w:r>
               <w:rPr>
@@ -361,10 +343,11 @@
               <w:lang w:eastAsia="en-NZ"/>
             </w:rPr>
           </w:pPr>
-          <w:hyperlink w:anchor="_Toc239624632" w:history="1">
+          <w:hyperlink w:anchor="_Toc241954342" w:history="1">
             <w:r>
               <w:rPr>
                 <w:rStyle w:val="Hyperlink"/>
+                <w:rFonts w:ascii="Times New Roman" w:hAnsi="Times New Roman" w:cs="Times New Roman"/>
                 <w:noProof/>
               </w:rPr>
               <w:t>Figure #1 Network topology</w:t>
@@ -388,7 +371,7 @@
                 <w:noProof/>
                 <w:webHidden/>
               </w:rPr>
-              <w:instrText xml:space="preserve"> PAGEREF _Toc239624632 \h </w:instrText>
+              <w:instrText xml:space="preserve"> PAGEREF _Toc241954342 \h </w:instrText>
             </w:r>
             <w:r>
               <w:rPr>
@@ -431,11 +414,11 @@
               <w:lang w:eastAsia="en-NZ"/>
             </w:rPr>
           </w:pPr>
-          <w:hyperlink w:anchor="_Toc239624633" w:history="1">
+          <w:hyperlink w:anchor="_Toc241954343" w:history="1">
             <w:r>
               <w:rPr>
                 <w:rStyle w:val="Hyperlink"/>
-                <w:rFonts w:ascii="Calibri" w:hAnsi="Calibri" w:cs="Calibri"/>
+                <w:rFonts w:ascii="Times New Roman" w:hAnsi="Times New Roman" w:cs="Times New Roman"/>
                 <w:noProof/>
               </w:rPr>
               <w:t>Vulnerabilities</w:t>
@@ -459,7 +442,7 @@
                 <w:noProof/>
                 <w:webHidden/>
               </w:rPr>
-              <w:instrText xml:space="preserve"> PAGEREF _Toc239624633 \h </w:instrText>
+              <w:instrText xml:space="preserve"> PAGEREF _Toc241954343 \h </w:instrText>
             </w:r>
             <w:r>
               <w:rPr>
@@ -502,11 +485,11 @@
               <w:lang w:eastAsia="en-NZ"/>
             </w:rPr>
           </w:pPr>
-          <w:hyperlink w:anchor="_Toc239624634" w:history="1">
+          <w:hyperlink w:anchor="_Toc241954344" w:history="1">
             <w:r>
               <w:rPr>
                 <w:rStyle w:val="Hyperlink"/>
-                <w:rFonts w:ascii="Calibri" w:hAnsi="Calibri" w:cs="Calibri"/>
+                <w:rFonts w:ascii="Times New Roman" w:hAnsi="Times New Roman" w:cs="Times New Roman"/>
                 <w:noProof/>
               </w:rPr>
               <w:t>Pair with WireShark for further analysis?</w:t>
@@ -530,7 +513,7 @@
                 <w:noProof/>
                 <w:webHidden/>
               </w:rPr>
-              <w:instrText xml:space="preserve"> PAGEREF _Toc239624634 \h </w:instrText>
+              <w:instrText xml:space="preserve"> PAGEREF _Toc241954344 \h </w:instrText>
             </w:r>
             <w:r>
               <w:rPr>
@@ -564,7 +547,7 @@
         <w:p>
           <w:pPr>
             <w:rPr>
-              <w:rFonts w:ascii="Calibri" w:hAnsi="Calibri" w:cs="Calibri"/>
+              <w:rFonts w:ascii="Times New Roman" w:hAnsi="Times New Roman" w:cs="Times New Roman"/>
               <w:b/>
               <w:bCs/>
               <w:lang w:val="en-GB"/>
@@ -572,7 +555,7 @@
           </w:pPr>
           <w:r>
             <w:rPr>
-              <w:rFonts w:ascii="Calibri" w:hAnsi="Calibri" w:cs="Calibri"/>
+              <w:rFonts w:ascii="Times New Roman" w:hAnsi="Times New Roman" w:cs="Times New Roman"/>
               <w:b/>
               <w:bCs/>
               <w:lang w:val="en-GB"/>
@@ -585,7 +568,7 @@
     <w:p>
       <w:pPr>
         <w:rPr>
-          <w:rFonts w:ascii="Calibri" w:hAnsi="Calibri" w:cs="Calibri"/>
+          <w:rFonts w:ascii="Times New Roman" w:hAnsi="Times New Roman" w:cs="Times New Roman"/>
           <w:b/>
           <w:bCs/>
           <w:lang w:val="en-GB"/>
@@ -596,14 +579,14 @@
       <w:pPr>
         <w:pStyle w:val="Heading1"/>
         <w:rPr>
-          <w:rFonts w:ascii="Calibri" w:hAnsi="Calibri" w:cs="Calibri"/>
+          <w:rFonts w:ascii="Times New Roman" w:hAnsi="Times New Roman" w:cs="Times New Roman"/>
           <w:lang w:val="en-GB"/>
         </w:rPr>
       </w:pPr>
-      <w:bookmarkStart w:id="0" w:name="_Toc239624629"/>
-      <w:r>
-        <w:rPr>
-          <w:rFonts w:ascii="Calibri" w:hAnsi="Calibri" w:cs="Calibri"/>
+      <w:bookmarkStart w:id="0" w:name="_Toc241954339"/>
+      <w:r>
+        <w:rPr>
+          <w:rFonts w:ascii="Times New Roman" w:hAnsi="Times New Roman" w:cs="Times New Roman"/>
           <w:lang w:val="en-GB"/>
         </w:rPr>
         <w:t>Summary report</w:t>
@@ -613,11 +596,13 @@
     <w:p>
       <w:pPr>
         <w:rPr>
+          <w:rFonts w:ascii="Times New Roman" w:hAnsi="Times New Roman" w:cs="Times New Roman"/>
           <w:lang w:val="en-GB"/>
         </w:rPr>
       </w:pPr>
       <w:r>
         <w:rPr>
+          <w:rFonts w:ascii="Times New Roman" w:hAnsi="Times New Roman" w:cs="Times New Roman"/>
           <w:lang w:val="en-GB"/>
         </w:rPr>
         <w:t xml:space="preserve">This network contains a series of 50 hosts on the network which includes 19 </w:t>
@@ -625,6 +610,7 @@
       <w:proofErr w:type="spellStart"/>
       <w:r>
         <w:rPr>
+          <w:rFonts w:ascii="Times New Roman" w:hAnsi="Times New Roman" w:cs="Times New Roman"/>
           <w:lang w:val="en-GB"/>
         </w:rPr>
         <w:t>linux</w:t>
@@ -632,6 +618,7 @@
       <w:proofErr w:type="spellEnd"/>
       <w:r>
         <w:rPr>
+          <w:rFonts w:ascii="Times New Roman" w:hAnsi="Times New Roman" w:cs="Times New Roman"/>
           <w:lang w:val="en-GB"/>
         </w:rPr>
         <w:t xml:space="preserve"> based operating systems and 3 windows-based systems, the rest are potentially IOT devices as they are running lightweight programs for operating systems.</w:t>
@@ -641,13 +628,13 @@
       <w:pPr>
         <w:pStyle w:val="Heading1"/>
         <w:rPr>
-          <w:rFonts w:ascii="Calibri" w:hAnsi="Calibri" w:cs="Calibri"/>
-        </w:rPr>
-      </w:pPr>
-      <w:bookmarkStart w:id="1" w:name="_Toc239624630"/>
-      <w:r>
-        <w:rPr>
-          <w:rFonts w:ascii="Calibri" w:hAnsi="Calibri" w:cs="Calibri"/>
+          <w:rFonts w:ascii="Times New Roman" w:hAnsi="Times New Roman" w:cs="Times New Roman"/>
+        </w:rPr>
+      </w:pPr>
+      <w:bookmarkStart w:id="1" w:name="_Toc241954340"/>
+      <w:r>
+        <w:rPr>
+          <w:rFonts w:ascii="Times New Roman" w:hAnsi="Times New Roman" w:cs="Times New Roman"/>
         </w:rPr>
         <w:t>General information</w:t>
       </w:r>
@@ -658,41 +645,20 @@
         <w:spacing w:after="0"/>
         <w:jc w:val="both"/>
         <w:rPr>
-          <w:rFonts w:ascii="Calibri" w:hAnsi="Calibri" w:cs="Calibri"/>
+          <w:rFonts w:ascii="Times New Roman" w:hAnsi="Times New Roman" w:cs="Times New Roman"/>
           <w:lang w:val="en-GB"/>
         </w:rPr>
       </w:pPr>
       <w:r>
         <w:rPr>
-          <w:rFonts w:ascii="Calibri" w:hAnsi="Calibri" w:cs="Calibri"/>
+          <w:rFonts w:ascii="Times New Roman" w:hAnsi="Times New Roman" w:cs="Times New Roman"/>
           <w:lang w:val="en-GB"/>
         </w:rPr>
-        <w:t>Started intense scan all</w:t>
-      </w:r>
-      <w:r>
-        <w:rPr>
-          <w:rFonts w:ascii="Calibri" w:hAnsi="Calibri" w:cs="Calibri"/>
-          <w:lang w:val="en-GB"/>
-        </w:rPr>
-        <w:t xml:space="preserve"> TCP</w:t>
-      </w:r>
-      <w:r>
-        <w:rPr>
-          <w:rFonts w:ascii="Calibri" w:hAnsi="Calibri" w:cs="Calibri"/>
-          <w:lang w:val="en-GB"/>
-        </w:rPr>
-        <w:t xml:space="preserve"> ports at 17:13</w:t>
-      </w:r>
-      <w:r>
-        <w:rPr>
-          <w:rFonts w:ascii="Calibri" w:hAnsi="Calibri" w:cs="Calibri"/>
-          <w:lang w:val="en-GB"/>
-        </w:rPr>
-        <w:t xml:space="preserve">, finished scanning the network 737.99 seconds/12 minutes </w:t>
-      </w:r>
-      <w:r>
-        <w:rPr>
-          <w:rFonts w:ascii="Calibri" w:hAnsi="Calibri" w:cs="Calibri"/>
+        <w:t xml:space="preserve">Started intense scan all TCP ports at 17:13, finished scanning the network 737.99 seconds/12 minutes </w:t>
+      </w:r>
+      <w:r>
+        <w:rPr>
+          <w:rFonts w:ascii="Times New Roman" w:hAnsi="Times New Roman" w:cs="Times New Roman"/>
           <w:lang w:val="en-GB"/>
         </w:rPr>
         <w:t>later.</w:t>
@@ -703,12 +669,12 @@
         <w:spacing w:after="0"/>
         <w:jc w:val="both"/>
         <w:rPr>
-          <w:rFonts w:ascii="Calibri" w:hAnsi="Calibri" w:cs="Calibri"/>
-        </w:rPr>
-      </w:pPr>
-      <w:r>
-        <w:rPr>
-          <w:rFonts w:ascii="Calibri" w:hAnsi="Calibri" w:cs="Calibri"/>
+          <w:rFonts w:ascii="Times New Roman" w:hAnsi="Times New Roman" w:cs="Times New Roman"/>
+        </w:rPr>
+      </w:pPr>
+      <w:r>
+        <w:rPr>
+          <w:rFonts w:ascii="Times New Roman" w:hAnsi="Times New Roman" w:cs="Times New Roman"/>
         </w:rPr>
         <w:t>Hosts up: 50</w:t>
       </w:r>
@@ -718,12 +684,12 @@
         <w:spacing w:after="0"/>
         <w:jc w:val="both"/>
         <w:rPr>
-          <w:rFonts w:ascii="Calibri" w:hAnsi="Calibri" w:cs="Calibri"/>
-        </w:rPr>
-      </w:pPr>
-      <w:r>
-        <w:rPr>
-          <w:rFonts w:ascii="Calibri" w:hAnsi="Calibri" w:cs="Calibri"/>
+          <w:rFonts w:ascii="Times New Roman" w:hAnsi="Times New Roman" w:cs="Times New Roman"/>
+        </w:rPr>
+      </w:pPr>
+      <w:r>
+        <w:rPr>
+          <w:rFonts w:ascii="Times New Roman" w:hAnsi="Times New Roman" w:cs="Times New Roman"/>
         </w:rPr>
         <w:t>Hosts down: 206</w:t>
       </w:r>
@@ -733,12 +699,12 @@
         <w:spacing w:after="0"/>
         <w:jc w:val="both"/>
         <w:rPr>
-          <w:rFonts w:ascii="Calibri" w:hAnsi="Calibri" w:cs="Calibri"/>
-        </w:rPr>
-      </w:pPr>
-      <w:r>
-        <w:rPr>
-          <w:rFonts w:ascii="Calibri" w:hAnsi="Calibri" w:cs="Calibri"/>
+          <w:rFonts w:ascii="Times New Roman" w:hAnsi="Times New Roman" w:cs="Times New Roman"/>
+        </w:rPr>
+      </w:pPr>
+      <w:r>
+        <w:rPr>
+          <w:rFonts w:ascii="Times New Roman" w:hAnsi="Times New Roman" w:cs="Times New Roman"/>
         </w:rPr>
         <w:t>Hosts scanned: 256</w:t>
       </w:r>
@@ -748,12 +714,12 @@
         <w:spacing w:after="0"/>
         <w:jc w:val="both"/>
         <w:rPr>
-          <w:rFonts w:ascii="Calibri" w:hAnsi="Calibri" w:cs="Calibri"/>
-        </w:rPr>
-      </w:pPr>
-      <w:r>
-        <w:rPr>
-          <w:rFonts w:ascii="Calibri" w:hAnsi="Calibri" w:cs="Calibri"/>
+          <w:rFonts w:ascii="Times New Roman" w:hAnsi="Times New Roman" w:cs="Times New Roman"/>
+        </w:rPr>
+      </w:pPr>
+      <w:r>
+        <w:rPr>
+          <w:rFonts w:ascii="Times New Roman" w:hAnsi="Times New Roman" w:cs="Times New Roman"/>
         </w:rPr>
         <w:t>Open Ports: 159</w:t>
       </w:r>
@@ -763,12 +729,12 @@
         <w:spacing w:after="0"/>
         <w:jc w:val="both"/>
         <w:rPr>
-          <w:rFonts w:ascii="Calibri" w:hAnsi="Calibri" w:cs="Calibri"/>
-        </w:rPr>
-      </w:pPr>
-      <w:r>
-        <w:rPr>
-          <w:rFonts w:ascii="Calibri" w:hAnsi="Calibri" w:cs="Calibri"/>
+          <w:rFonts w:ascii="Times New Roman" w:hAnsi="Times New Roman" w:cs="Times New Roman"/>
+        </w:rPr>
+      </w:pPr>
+      <w:r>
+        <w:rPr>
+          <w:rFonts w:ascii="Times New Roman" w:hAnsi="Times New Roman" w:cs="Times New Roman"/>
         </w:rPr>
         <w:t>Filtered Ports: 8139</w:t>
       </w:r>
@@ -778,12 +744,12 @@
         <w:spacing w:after="0"/>
         <w:jc w:val="both"/>
         <w:rPr>
-          <w:rFonts w:ascii="Calibri" w:hAnsi="Calibri" w:cs="Calibri"/>
-        </w:rPr>
-      </w:pPr>
-      <w:r>
-        <w:rPr>
-          <w:rFonts w:ascii="Calibri" w:hAnsi="Calibri" w:cs="Calibri"/>
+          <w:rFonts w:ascii="Times New Roman" w:hAnsi="Times New Roman" w:cs="Times New Roman"/>
+        </w:rPr>
+      </w:pPr>
+      <w:r>
+        <w:rPr>
+          <w:rFonts w:ascii="Times New Roman" w:hAnsi="Times New Roman" w:cs="Times New Roman"/>
         </w:rPr>
         <w:t>Closed Ports: 41702</w:t>
       </w:r>
@@ -791,21 +757,21 @@
     <w:p>
       <w:pPr>
         <w:rPr>
-          <w:rFonts w:ascii="Calibri" w:hAnsi="Calibri" w:cs="Calibri"/>
-        </w:rPr>
-      </w:pPr>
-    </w:p>
-    <w:p>
-      <w:pPr>
-        <w:rPr>
-          <w:rFonts w:ascii="Calibri" w:hAnsi="Calibri" w:cs="Calibri"/>
-        </w:rPr>
-      </w:pPr>
-    </w:p>
-    <w:p>
-      <w:pPr>
-        <w:rPr>
-          <w:rFonts w:ascii="Calibri" w:hAnsi="Calibri" w:cs="Calibri"/>
+          <w:rFonts w:ascii="Times New Roman" w:hAnsi="Times New Roman" w:cs="Times New Roman"/>
+        </w:rPr>
+      </w:pPr>
+    </w:p>
+    <w:p>
+      <w:pPr>
+        <w:rPr>
+          <w:rFonts w:ascii="Times New Roman" w:hAnsi="Times New Roman" w:cs="Times New Roman"/>
+        </w:rPr>
+      </w:pPr>
+    </w:p>
+    <w:p>
+      <w:pPr>
+        <w:rPr>
+          <w:rFonts w:ascii="Times New Roman" w:hAnsi="Times New Roman" w:cs="Times New Roman"/>
         </w:rPr>
       </w:pPr>
     </w:p>
@@ -813,13 +779,13 @@
       <w:pPr>
         <w:pStyle w:val="Heading1"/>
         <w:rPr>
-          <w:rFonts w:ascii="Calibri" w:hAnsi="Calibri" w:cs="Calibri"/>
-        </w:rPr>
-      </w:pPr>
-      <w:bookmarkStart w:id="2" w:name="_Toc239624631"/>
-      <w:r>
-        <w:rPr>
-          <w:rFonts w:ascii="Calibri" w:hAnsi="Calibri" w:cs="Calibri"/>
+          <w:rFonts w:ascii="Times New Roman" w:hAnsi="Times New Roman" w:cs="Times New Roman"/>
+        </w:rPr>
+      </w:pPr>
+      <w:bookmarkStart w:id="2" w:name="_Toc241954341"/>
+      <w:r>
+        <w:rPr>
+          <w:rFonts w:ascii="Times New Roman" w:hAnsi="Times New Roman" w:cs="Times New Roman"/>
         </w:rPr>
         <w:lastRenderedPageBreak/>
         <w:t>Description of the network</w:t>
@@ -829,38 +795,74 @@
     <w:p>
       <w:pPr>
         <w:jc w:val="both"/>
-      </w:pPr>
-      <w:r>
+        <w:rPr>
+          <w:rFonts w:ascii="Times New Roman" w:hAnsi="Times New Roman" w:cs="Times New Roman"/>
+        </w:rPr>
+      </w:pPr>
+      <w:r>
+        <w:rPr>
+          <w:rFonts w:ascii="Times New Roman" w:hAnsi="Times New Roman" w:cs="Times New Roman"/>
+        </w:rPr>
         <w:t>The network that has been scanned is a rather large network for a personal home network and consists of one router, four wireless access points</w:t>
       </w:r>
       <w:r>
+        <w:rPr>
+          <w:rFonts w:ascii="Times New Roman" w:hAnsi="Times New Roman" w:cs="Times New Roman"/>
+        </w:rPr>
         <w:t xml:space="preserve"> as well as 11 hosts with some filtered ports.</w:t>
       </w:r>
     </w:p>
     <w:p>
       <w:pPr>
         <w:jc w:val="both"/>
-      </w:pPr>
-      <w:r>
+        <w:rPr>
+          <w:rFonts w:ascii="Times New Roman" w:hAnsi="Times New Roman" w:cs="Times New Roman"/>
+        </w:rPr>
+      </w:pPr>
+      <w:r>
+        <w:rPr>
+          <w:rFonts w:ascii="Times New Roman" w:hAnsi="Times New Roman" w:cs="Times New Roman"/>
+        </w:rPr>
         <w:t xml:space="preserve">There are 19 </w:t>
       </w:r>
       <w:r>
+        <w:rPr>
+          <w:rFonts w:ascii="Times New Roman" w:hAnsi="Times New Roman" w:cs="Times New Roman"/>
+        </w:rPr>
         <w:t>Linux</w:t>
       </w:r>
       <w:r>
+        <w:rPr>
+          <w:rFonts w:ascii="Times New Roman" w:hAnsi="Times New Roman" w:cs="Times New Roman"/>
+        </w:rPr>
         <w:t xml:space="preserve"> based operating systems operating on this network and </w:t>
       </w:r>
       <w:r>
+        <w:rPr>
+          <w:rFonts w:ascii="Times New Roman" w:hAnsi="Times New Roman" w:cs="Times New Roman"/>
+        </w:rPr>
         <w:t>3 windows based operating systems.</w:t>
       </w:r>
     </w:p>
-    <w:p/>
+    <w:p>
+      <w:pPr>
+        <w:rPr>
+          <w:rFonts w:ascii="Times New Roman" w:hAnsi="Times New Roman" w:cs="Times New Roman"/>
+        </w:rPr>
+      </w:pPr>
+    </w:p>
     <w:p>
       <w:pPr>
         <w:pStyle w:val="Heading2"/>
-      </w:pPr>
-      <w:bookmarkStart w:id="3" w:name="_Toc239624632"/>
-      <w:r>
+        <w:rPr>
+          <w:rFonts w:ascii="Times New Roman" w:hAnsi="Times New Roman" w:cs="Times New Roman"/>
+        </w:rPr>
+      </w:pPr>
+      <w:bookmarkStart w:id="3" w:name="_Toc241954342"/>
+      <w:r>
+        <w:rPr>
+          <w:rFonts w:ascii="Times New Roman" w:hAnsi="Times New Roman" w:cs="Times New Roman"/>
+        </w:rPr>
         <w:t>Figure #1 Network topology</w:t>
       </w:r>
       <w:bookmarkEnd w:id="3"/>
@@ -868,12 +870,12 @@
     <w:p>
       <w:pPr>
         <w:rPr>
-          <w:rFonts w:ascii="Calibri" w:hAnsi="Calibri" w:cs="Calibri"/>
-        </w:rPr>
-      </w:pPr>
-      <w:r>
-        <w:rPr>
-          <w:rFonts w:ascii="Calibri" w:hAnsi="Calibri" w:cs="Calibri"/>
+          <w:rFonts w:ascii="Times New Roman" w:hAnsi="Times New Roman" w:cs="Times New Roman"/>
+        </w:rPr>
+      </w:pPr>
+      <w:r>
+        <w:rPr>
+          <w:rFonts w:ascii="Times New Roman" w:hAnsi="Times New Roman" w:cs="Times New Roman"/>
           <w:noProof/>
         </w:rPr>
         <w:drawing>
@@ -923,35 +925,58 @@
       <w:pPr>
         <w:pStyle w:val="Heading1"/>
         <w:rPr>
-          <w:rFonts w:ascii="Calibri" w:hAnsi="Calibri" w:cs="Calibri"/>
-        </w:rPr>
-      </w:pPr>
-      <w:bookmarkStart w:id="4" w:name="_Toc239624633"/>
-      <w:r>
-        <w:rPr>
-          <w:rFonts w:ascii="Calibri" w:hAnsi="Calibri" w:cs="Calibri"/>
+          <w:rFonts w:ascii="Times New Roman" w:hAnsi="Times New Roman" w:cs="Times New Roman"/>
+        </w:rPr>
+      </w:pPr>
+      <w:bookmarkStart w:id="4" w:name="_Toc241954343"/>
+      <w:r>
+        <w:rPr>
+          <w:rFonts w:ascii="Times New Roman" w:hAnsi="Times New Roman" w:cs="Times New Roman"/>
         </w:rPr>
         <w:t>Vulnerabilities</w:t>
       </w:r>
       <w:bookmarkEnd w:id="4"/>
     </w:p>
     <w:p>
-      <w:r>
+      <w:pPr>
+        <w:rPr>
+          <w:rFonts w:ascii="Times New Roman" w:hAnsi="Times New Roman" w:cs="Times New Roman"/>
+        </w:rPr>
+      </w:pPr>
+      <w:r>
+        <w:rPr>
+          <w:rFonts w:ascii="Times New Roman" w:hAnsi="Times New Roman" w:cs="Times New Roman"/>
+        </w:rPr>
         <w:t xml:space="preserve">For this section I have selected </w:t>
       </w:r>
       <w:r>
+        <w:rPr>
+          <w:rFonts w:ascii="Times New Roman" w:hAnsi="Times New Roman" w:cs="Times New Roman"/>
+        </w:rPr>
         <w:t xml:space="preserve">the IP address </w:t>
       </w:r>
       <w:r>
+        <w:rPr>
+          <w:rFonts w:ascii="Times New Roman" w:hAnsi="Times New Roman" w:cs="Times New Roman"/>
+        </w:rPr>
         <w:t>1.74</w:t>
       </w:r>
       <w:r>
+        <w:rPr>
+          <w:rFonts w:ascii="Times New Roman" w:hAnsi="Times New Roman" w:cs="Times New Roman"/>
+        </w:rPr>
         <w:t xml:space="preserve"> to scan for vulnerabilities as an example of what it might look like in a report.</w:t>
       </w:r>
     </w:p>
     <w:p>
-      <w:r>
-        <w:rPr>
+      <w:pPr>
+        <w:rPr>
+          <w:rFonts w:ascii="Times New Roman" w:hAnsi="Times New Roman" w:cs="Times New Roman"/>
+        </w:rPr>
+      </w:pPr>
+      <w:r>
+        <w:rPr>
+          <w:rFonts w:ascii="Times New Roman" w:hAnsi="Times New Roman" w:cs="Times New Roman"/>
           <w:noProof/>
         </w:rPr>
         <w:lastRenderedPageBreak/>
@@ -998,11 +1023,17 @@
         </w:drawing>
       </w:r>
     </w:p>
-    <w:p/>
-    <w:p>
-      <w:pPr>
-        <w:rPr>
-          <w:rFonts w:ascii="Calibri" w:hAnsi="Calibri" w:cs="Calibri"/>
+    <w:p>
+      <w:pPr>
+        <w:rPr>
+          <w:rFonts w:ascii="Times New Roman" w:hAnsi="Times New Roman" w:cs="Times New Roman"/>
+        </w:rPr>
+      </w:pPr>
+    </w:p>
+    <w:p>
+      <w:pPr>
+        <w:rPr>
+          <w:rFonts w:ascii="Times New Roman" w:hAnsi="Times New Roman" w:cs="Times New Roman"/>
         </w:rPr>
       </w:pPr>
     </w:p>
@@ -1010,13 +1041,13 @@
       <w:pPr>
         <w:pStyle w:val="Heading1"/>
         <w:rPr>
-          <w:rFonts w:ascii="Calibri" w:hAnsi="Calibri" w:cs="Calibri"/>
-        </w:rPr>
-      </w:pPr>
-      <w:bookmarkStart w:id="5" w:name="_Toc239624634"/>
-      <w:r>
-        <w:rPr>
-          <w:rFonts w:ascii="Calibri" w:hAnsi="Calibri" w:cs="Calibri"/>
+          <w:rFonts w:ascii="Times New Roman" w:hAnsi="Times New Roman" w:cs="Times New Roman"/>
+        </w:rPr>
+      </w:pPr>
+      <w:bookmarkStart w:id="5" w:name="_Toc241954344"/>
+      <w:r>
+        <w:rPr>
+          <w:rFonts w:ascii="Times New Roman" w:hAnsi="Times New Roman" w:cs="Times New Roman"/>
         </w:rPr>
         <w:t>Pair with WireShark for further analysis?</w:t>
       </w:r>
@@ -1025,28 +1056,28 @@
     <w:p>
       <w:pPr>
         <w:rPr>
-          <w:rFonts w:ascii="Calibri" w:hAnsi="Calibri" w:cs="Calibri"/>
-        </w:rPr>
-      </w:pPr>
-    </w:p>
-    <w:p>
-      <w:pPr>
-        <w:rPr>
-          <w:rFonts w:ascii="Calibri" w:hAnsi="Calibri" w:cs="Calibri"/>
-        </w:rPr>
-      </w:pPr>
-    </w:p>
-    <w:p>
-      <w:pPr>
-        <w:rPr>
-          <w:rFonts w:ascii="Calibri" w:hAnsi="Calibri" w:cs="Calibri"/>
+          <w:rFonts w:ascii="Times New Roman" w:hAnsi="Times New Roman" w:cs="Times New Roman"/>
+        </w:rPr>
+      </w:pPr>
+    </w:p>
+    <w:p>
+      <w:pPr>
+        <w:rPr>
+          <w:rFonts w:ascii="Times New Roman" w:hAnsi="Times New Roman" w:cs="Times New Roman"/>
+        </w:rPr>
+      </w:pPr>
+    </w:p>
+    <w:p>
+      <w:pPr>
+        <w:rPr>
+          <w:rFonts w:ascii="Times New Roman" w:hAnsi="Times New Roman" w:cs="Times New Roman"/>
           <w:i/>
           <w:iCs/>
         </w:rPr>
       </w:pPr>
       <w:r>
         <w:rPr>
-          <w:rFonts w:ascii="Calibri" w:hAnsi="Calibri" w:cs="Calibri"/>
+          <w:rFonts w:ascii="Times New Roman" w:hAnsi="Times New Roman" w:cs="Times New Roman"/>
           <w:i/>
           <w:iCs/>
         </w:rPr>
@@ -1054,11 +1085,11 @@
       </w:r>
       <w:r>
         <w:rPr>
-          <w:rFonts w:ascii="Calibri" w:hAnsi="Calibri" w:cs="Calibri"/>
+          <w:rFonts w:ascii="Times New Roman" w:hAnsi="Times New Roman" w:cs="Times New Roman"/>
           <w:i/>
           <w:iCs/>
         </w:rPr>
-        <w:t xml:space="preserve"> (I’ll be honest I didn’t quite know what to write so most of it was me scratching my head).</w:t>
+        <w:t>.</w:t>
       </w:r>
     </w:p>
     <w:sectPr>

</xml_diff>